<commit_message>
Ajustes por advertencias preexistentes de paquetes vulnerables y del SDK .NET
</commit_message>
<xml_diff>
--- a/por implementar 14 octubre 2026, ver página 3.docx
+++ b/por implementar 14 octubre 2026, ver página 3.docx
@@ -40,7 +40,7 @@
     </w:p>
     <w:p>
       <w:pPr>
-        <w:pStyle w:val="Lneahorizontal"/>
+        <w:pStyle w:val="Lneahorizontaluser"/>
         <w:suppressLineNumbers/>
         <w:pBdr>
           <w:bottom w:val="double" w:sz="2" w:space="0" w:color="808080"/>
@@ -57,6 +57,10 @@
     <w:p>
       <w:pPr>
         <w:pStyle w:val="Heading2"/>
+        <w:numPr>
+          <w:ilvl w:val="1"/>
+          <w:numId w:val="1"/>
+        </w:numPr>
         <w:bidi w:val="0"/>
         <w:ind w:hanging="0" w:left="0"/>
         <w:jc w:val="left"/>
@@ -91,7 +95,6 @@
           <w:numId w:val="2"/>
         </w:numPr>
         <w:tabs>
-          <w:tab w:val="clear" w:pos="709"/>
           <w:tab w:val="left" w:pos="709" w:leader="none"/>
         </w:tabs>
         <w:bidi w:val="0"/>
@@ -128,7 +131,6 @@
           <w:numId w:val="2"/>
         </w:numPr>
         <w:tabs>
-          <w:tab w:val="clear" w:pos="709"/>
           <w:tab w:val="left" w:pos="709" w:leader="none"/>
         </w:tabs>
         <w:bidi w:val="0"/>
@@ -155,7 +157,6 @@
           <w:numId w:val="2"/>
         </w:numPr>
         <w:tabs>
-          <w:tab w:val="clear" w:pos="709"/>
           <w:tab w:val="left" w:pos="709" w:leader="none"/>
         </w:tabs>
         <w:bidi w:val="0"/>
@@ -192,7 +193,6 @@
           <w:numId w:val="2"/>
         </w:numPr>
         <w:tabs>
-          <w:tab w:val="clear" w:pos="709"/>
           <w:tab w:val="left" w:pos="709" w:leader="none"/>
         </w:tabs>
         <w:bidi w:val="0"/>
@@ -229,7 +229,6 @@
           <w:numId w:val="2"/>
         </w:numPr>
         <w:tabs>
-          <w:tab w:val="clear" w:pos="709"/>
           <w:tab w:val="left" w:pos="709" w:leader="none"/>
         </w:tabs>
         <w:bidi w:val="0"/>
@@ -256,7 +255,6 @@
           <w:numId w:val="2"/>
         </w:numPr>
         <w:tabs>
-          <w:tab w:val="clear" w:pos="709"/>
           <w:tab w:val="left" w:pos="709" w:leader="none"/>
         </w:tabs>
         <w:bidi w:val="0"/>
@@ -297,7 +295,7 @@
     </w:p>
     <w:p>
       <w:pPr>
-        <w:pStyle w:val="Lneahorizontal"/>
+        <w:pStyle w:val="Lneahorizontaluser"/>
         <w:bidi w:val="0"/>
         <w:jc w:val="left"/>
         <w:rPr/>
@@ -309,6 +307,10 @@
     <w:p>
       <w:pPr>
         <w:pStyle w:val="Heading2"/>
+        <w:numPr>
+          <w:ilvl w:val="1"/>
+          <w:numId w:val="1"/>
+        </w:numPr>
         <w:bidi w:val="0"/>
         <w:ind w:hanging="0" w:left="0"/>
         <w:jc w:val="left"/>
@@ -349,7 +351,6 @@
           <w:numId w:val="3"/>
         </w:numPr>
         <w:tabs>
-          <w:tab w:val="clear" w:pos="709"/>
           <w:tab w:val="left" w:pos="709" w:leader="none"/>
         </w:tabs>
         <w:bidi w:val="0"/>
@@ -404,7 +405,6 @@
           <w:numId w:val="4"/>
         </w:numPr>
         <w:tabs>
-          <w:tab w:val="clear" w:pos="709"/>
           <w:tab w:val="left" w:pos="709" w:leader="none"/>
         </w:tabs>
         <w:bidi w:val="0"/>
@@ -425,7 +425,6 @@
           <w:numId w:val="4"/>
         </w:numPr>
         <w:tabs>
-          <w:tab w:val="clear" w:pos="709"/>
           <w:tab w:val="left" w:pos="709" w:leader="none"/>
         </w:tabs>
         <w:bidi w:val="0"/>
@@ -462,7 +461,6 @@
           <w:numId w:val="4"/>
         </w:numPr>
         <w:tabs>
-          <w:tab w:val="clear" w:pos="709"/>
           <w:tab w:val="left" w:pos="709" w:leader="none"/>
         </w:tabs>
         <w:bidi w:val="0"/>
@@ -493,7 +491,6 @@
           <w:numId w:val="4"/>
         </w:numPr>
         <w:tabs>
-          <w:tab w:val="clear" w:pos="709"/>
           <w:tab w:val="left" w:pos="709" w:leader="none"/>
         </w:tabs>
         <w:bidi w:val="0"/>
@@ -524,7 +521,6 @@
           <w:numId w:val="4"/>
         </w:numPr>
         <w:tabs>
-          <w:tab w:val="clear" w:pos="709"/>
           <w:tab w:val="left" w:pos="709" w:leader="none"/>
         </w:tabs>
         <w:bidi w:val="0"/>
@@ -559,7 +555,6 @@
           <w:numId w:val="5"/>
         </w:numPr>
         <w:tabs>
-          <w:tab w:val="clear" w:pos="709"/>
           <w:tab w:val="left" w:pos="709" w:leader="none"/>
         </w:tabs>
         <w:bidi w:val="0"/>
@@ -616,7 +611,6 @@
           <w:numId w:val="5"/>
         </w:numPr>
         <w:tabs>
-          <w:tab w:val="clear" w:pos="709"/>
           <w:tab w:val="left" w:pos="709" w:leader="none"/>
         </w:tabs>
         <w:bidi w:val="0"/>
@@ -723,7 +717,6 @@
           <w:numId w:val="5"/>
         </w:numPr>
         <w:tabs>
-          <w:tab w:val="clear" w:pos="709"/>
           <w:tab w:val="left" w:pos="709" w:leader="none"/>
         </w:tabs>
         <w:bidi w:val="0"/>
@@ -782,7 +775,7 @@
     </w:p>
     <w:p>
       <w:pPr>
-        <w:pStyle w:val="Lneahorizontal"/>
+        <w:pStyle w:val="Lneahorizontaluser"/>
         <w:bidi w:val="0"/>
         <w:jc w:val="left"/>
         <w:rPr/>
@@ -794,6 +787,10 @@
     <w:p>
       <w:pPr>
         <w:pStyle w:val="Heading2"/>
+        <w:numPr>
+          <w:ilvl w:val="1"/>
+          <w:numId w:val="1"/>
+        </w:numPr>
         <w:bidi w:val="0"/>
         <w:ind w:hanging="0" w:left="0"/>
         <w:jc w:val="left"/>
@@ -830,7 +827,6 @@
           <w:numId w:val="6"/>
         </w:numPr>
         <w:tabs>
-          <w:tab w:val="clear" w:pos="709"/>
           <w:tab w:val="left" w:pos="709" w:leader="none"/>
         </w:tabs>
         <w:bidi w:val="0"/>
@@ -867,7 +863,6 @@
           <w:numId w:val="6"/>
         </w:numPr>
         <w:tabs>
-          <w:tab w:val="clear" w:pos="709"/>
           <w:tab w:val="left" w:pos="709" w:leader="none"/>
         </w:tabs>
         <w:bidi w:val="0"/>
@@ -904,7 +899,6 @@
           <w:numId w:val="6"/>
         </w:numPr>
         <w:tabs>
-          <w:tab w:val="clear" w:pos="709"/>
           <w:tab w:val="left" w:pos="709" w:leader="none"/>
         </w:tabs>
         <w:bidi w:val="0"/>
@@ -951,7 +945,6 @@
           <w:numId w:val="6"/>
         </w:numPr>
         <w:tabs>
-          <w:tab w:val="clear" w:pos="709"/>
           <w:tab w:val="left" w:pos="709" w:leader="none"/>
         </w:tabs>
         <w:bidi w:val="0"/>
@@ -992,7 +985,6 @@
           <w:numId w:val="7"/>
         </w:numPr>
         <w:tabs>
-          <w:tab w:val="clear" w:pos="709"/>
           <w:tab w:val="left" w:pos="709" w:leader="none"/>
         </w:tabs>
         <w:bidi w:val="0"/>
@@ -1037,7 +1029,7 @@
     </w:p>
     <w:p>
       <w:pPr>
-        <w:pStyle w:val="Lneahorizontal"/>
+        <w:pStyle w:val="Lneahorizontaluser"/>
         <w:bidi w:val="0"/>
         <w:jc w:val="left"/>
         <w:rPr/>
@@ -1049,6 +1041,10 @@
     <w:p>
       <w:pPr>
         <w:pStyle w:val="Heading2"/>
+        <w:numPr>
+          <w:ilvl w:val="1"/>
+          <w:numId w:val="1"/>
+        </w:numPr>
         <w:bidi w:val="0"/>
         <w:ind w:hanging="0" w:left="0"/>
         <w:jc w:val="left"/>
@@ -1077,7 +1073,7 @@
     </w:p>
     <w:p>
       <w:pPr>
-        <w:pStyle w:val="Lneahorizontal"/>
+        <w:pStyle w:val="Lneahorizontaluser"/>
         <w:bidi w:val="0"/>
         <w:jc w:val="left"/>
         <w:rPr/>
@@ -1089,6 +1085,10 @@
     <w:p>
       <w:pPr>
         <w:pStyle w:val="Heading2"/>
+        <w:numPr>
+          <w:ilvl w:val="1"/>
+          <w:numId w:val="1"/>
+        </w:numPr>
         <w:bidi w:val="0"/>
         <w:ind w:hanging="0" w:left="0"/>
         <w:jc w:val="left"/>
@@ -1101,7 +1101,7 @@
     </w:p>
     <w:p>
       <w:pPr>
-        <w:pStyle w:val="Citaenbloque"/>
+        <w:pStyle w:val="Citaenbloqueuser"/>
         <w:bidi w:val="0"/>
         <w:jc w:val="left"/>
         <w:rPr/>
@@ -1140,6 +1140,10 @@
     <w:p>
       <w:pPr>
         <w:pStyle w:val="Heading3"/>
+        <w:numPr>
+          <w:ilvl w:val="2"/>
+          <w:numId w:val="1"/>
+        </w:numPr>
         <w:bidi w:val="0"/>
         <w:ind w:hanging="0" w:left="0"/>
         <w:jc w:val="left"/>
@@ -1158,7 +1162,6 @@
           <w:numId w:val="8"/>
         </w:numPr>
         <w:tabs>
-          <w:tab w:val="clear" w:pos="709"/>
           <w:tab w:val="left" w:pos="709" w:leader="none"/>
         </w:tabs>
         <w:bidi w:val="0"/>
@@ -1199,7 +1202,6 @@
           <w:numId w:val="8"/>
         </w:numPr>
         <w:tabs>
-          <w:tab w:val="clear" w:pos="709"/>
           <w:tab w:val="left" w:pos="709" w:leader="none"/>
         </w:tabs>
         <w:bidi w:val="0"/>
@@ -1240,7 +1242,6 @@
           <w:numId w:val="8"/>
         </w:numPr>
         <w:tabs>
-          <w:tab w:val="clear" w:pos="709"/>
           <w:tab w:val="left" w:pos="709" w:leader="none"/>
         </w:tabs>
         <w:bidi w:val="0"/>
@@ -1303,6 +1304,7 @@
       <w:pPr>
         <w:pStyle w:val="BodyText"/>
         <w:bidi w:val="0"/>
+        <w:spacing w:before="0" w:after="140"/>
         <w:jc w:val="left"/>
         <w:rPr/>
       </w:pPr>
@@ -1366,7 +1368,7 @@
           </w:tcPr>
           <w:p>
             <w:pPr>
-              <w:pStyle w:val="Ttulodelatabla"/>
+              <w:pStyle w:val="Ttulodelatablauser"/>
               <w:bidi w:val="0"/>
               <w:jc w:val="left"/>
               <w:rPr/>
@@ -1388,7 +1390,7 @@
           </w:tcPr>
           <w:p>
             <w:pPr>
-              <w:pStyle w:val="Ttulodelatabla"/>
+              <w:pStyle w:val="Ttulodelatablauser"/>
               <w:bidi w:val="0"/>
               <w:jc w:val="left"/>
               <w:rPr/>
@@ -1411,7 +1413,7 @@
           </w:tcPr>
           <w:p>
             <w:pPr>
-              <w:pStyle w:val="Ttulodelatabla"/>
+              <w:pStyle w:val="Ttulodelatablauser"/>
               <w:bidi w:val="0"/>
               <w:jc w:val="left"/>
               <w:rPr/>
@@ -1435,7 +1437,7 @@
           </w:tcPr>
           <w:p>
             <w:pPr>
-              <w:pStyle w:val="Contenidodelatabla"/>
+              <w:pStyle w:val="Contenidodelatablauser"/>
               <w:bidi w:val="0"/>
               <w:jc w:val="left"/>
               <w:rPr/>
@@ -1458,7 +1460,7 @@
           </w:tcPr>
           <w:p>
             <w:pPr>
-              <w:pStyle w:val="Contenidodelatabla"/>
+              <w:pStyle w:val="Contenidodelatablauser"/>
               <w:bidi w:val="0"/>
               <w:jc w:val="left"/>
               <w:rPr>
@@ -1485,7 +1487,7 @@
           </w:tcPr>
           <w:p>
             <w:pPr>
-              <w:pStyle w:val="Contenidodelatabla"/>
+              <w:pStyle w:val="Contenidodelatablauser"/>
               <w:bidi w:val="0"/>
               <w:jc w:val="left"/>
               <w:rPr/>
@@ -1509,7 +1511,7 @@
           </w:tcPr>
           <w:p>
             <w:pPr>
-              <w:pStyle w:val="Contenidodelatabla"/>
+              <w:pStyle w:val="Contenidodelatablauser"/>
               <w:bidi w:val="0"/>
               <w:jc w:val="left"/>
               <w:rPr/>
@@ -1532,13 +1534,18 @@
           </w:tcPr>
           <w:p>
             <w:pPr>
-              <w:pStyle w:val="Contenidodelatabla"/>
+              <w:pStyle w:val="Contenidodelatablauser"/>
               <w:bidi w:val="0"/>
               <w:jc w:val="left"/>
-              <w:rPr/>
+              <w:rPr>
+                <w:highlight w:val="none"/>
+                <w:shd w:fill="FFFF00" w:val="clear"/>
+              </w:rPr>
             </w:pPr>
             <w:r>
-              <w:rPr/>
+              <w:rPr>
+                <w:shd w:fill="FFFF00" w:val="clear"/>
+              </w:rPr>
               <w:t>Definir cómo impedir o manejar ventas y notas de crédito en periodos cerrados (§1.3); hacer atómica la conversión OV → venta (§6.2); unificar ingresos y gastos del Estado de Resultados con sus asientos contables (§1.4b).</w:t>
             </w:r>
           </w:p>
@@ -1554,7 +1561,7 @@
           </w:tcPr>
           <w:p>
             <w:pPr>
-              <w:pStyle w:val="Contenidodelatabla"/>
+              <w:pStyle w:val="Contenidodelatablauser"/>
               <w:bidi w:val="0"/>
               <w:jc w:val="left"/>
               <w:rPr/>
@@ -1578,7 +1585,7 @@
           </w:tcPr>
           <w:p>
             <w:pPr>
-              <w:pStyle w:val="Contenidodelatabla"/>
+              <w:pStyle w:val="Contenidodelatablauser"/>
               <w:bidi w:val="0"/>
               <w:jc w:val="left"/>
               <w:rPr/>
@@ -1601,23 +1608,31 @@
           </w:tcPr>
           <w:p>
             <w:pPr>
-              <w:pStyle w:val="Contenidodelatabla"/>
+              <w:pStyle w:val="Contenidodelatablauser"/>
               <w:bidi w:val="0"/>
               <w:jc w:val="left"/>
-              <w:rPr/>
+              <w:rPr>
+                <w:highlight w:val="none"/>
+                <w:shd w:fill="FFFF00" w:val="clear"/>
+              </w:rPr>
             </w:pPr>
             <w:r>
-              <w:rPr/>
+              <w:rPr>
+                <w:shd w:fill="FFFF00" w:val="clear"/>
+              </w:rPr>
               <w:t xml:space="preserve">Agregar </w:t>
             </w:r>
             <w:r>
               <w:rPr>
                 <w:rFonts w:ascii="Liberation Mono" w:hAnsi="Liberation Mono"/>
+                <w:shd w:fill="FFFF00" w:val="clear"/>
               </w:rPr>
               <w:t>Cliente.LimiteCredito</w:t>
             </w:r>
             <w:r>
-              <w:rPr/>
+              <w:rPr>
+                <w:shd w:fill="FFFF00" w:val="clear"/>
+              </w:rPr>
               <w:t>, administrarlo desde la UI y bloquear POS/facturación según saldo vencido (§1.2 y §4.1).</w:t>
             </w:r>
           </w:p>
@@ -1633,7 +1648,7 @@
           </w:tcPr>
           <w:p>
             <w:pPr>
-              <w:pStyle w:val="Contenidodelatabla"/>
+              <w:pStyle w:val="Contenidodelatablauser"/>
               <w:bidi w:val="0"/>
               <w:jc w:val="left"/>
               <w:rPr/>
@@ -1657,7 +1672,7 @@
           </w:tcPr>
           <w:p>
             <w:pPr>
-              <w:pStyle w:val="Contenidodelatabla"/>
+              <w:pStyle w:val="Contenidodelatablauser"/>
               <w:bidi w:val="0"/>
               <w:jc w:val="left"/>
               <w:rPr/>
@@ -1680,13 +1695,18 @@
           </w:tcPr>
           <w:p>
             <w:pPr>
-              <w:pStyle w:val="Contenidodelatabla"/>
+              <w:pStyle w:val="Contenidodelatablauser"/>
               <w:bidi w:val="0"/>
               <w:jc w:val="left"/>
-              <w:rPr/>
+              <w:rPr>
+                <w:highlight w:val="none"/>
+                <w:shd w:fill="FFFF00" w:val="clear"/>
+              </w:rPr>
             </w:pPr>
             <w:r>
-              <w:rPr/>
+              <w:rPr>
+                <w:shd w:fill="FFFF00" w:val="clear"/>
+              </w:rPr>
               <w:t>Probar CxC/CxP, parche y cierre de periodos, y los reportes financieros en una base PostgreSQL de prueba (§1.2, §1.3, §1.4 y §7).</w:t>
             </w:r>
           </w:p>
@@ -1702,7 +1722,7 @@
           </w:tcPr>
           <w:p>
             <w:pPr>
-              <w:pStyle w:val="Contenidodelatabla"/>
+              <w:pStyle w:val="Contenidodelatablauser"/>
               <w:bidi w:val="0"/>
               <w:jc w:val="left"/>
               <w:rPr/>
@@ -1726,7 +1746,7 @@
           </w:tcPr>
           <w:p>
             <w:pPr>
-              <w:pStyle w:val="Contenidodelatabla"/>
+              <w:pStyle w:val="Contenidodelatablauser"/>
               <w:bidi w:val="0"/>
               <w:jc w:val="left"/>
               <w:rPr/>
@@ -1749,7 +1769,7 @@
           </w:tcPr>
           <w:p>
             <w:pPr>
-              <w:pStyle w:val="Contenidodelatabla"/>
+              <w:pStyle w:val="Contenidodelatablauser"/>
               <w:bidi w:val="0"/>
               <w:jc w:val="left"/>
               <w:rPr/>
@@ -1771,7 +1791,7 @@
           </w:tcPr>
           <w:p>
             <w:pPr>
-              <w:pStyle w:val="Contenidodelatabla"/>
+              <w:pStyle w:val="Contenidodelatablauser"/>
               <w:bidi w:val="0"/>
               <w:jc w:val="left"/>
               <w:rPr/>
@@ -1795,7 +1815,7 @@
           </w:tcPr>
           <w:p>
             <w:pPr>
-              <w:pStyle w:val="Contenidodelatabla"/>
+              <w:pStyle w:val="Contenidodelatablauser"/>
               <w:bidi w:val="0"/>
               <w:jc w:val="left"/>
               <w:rPr/>
@@ -1818,7 +1838,7 @@
           </w:tcPr>
           <w:p>
             <w:pPr>
-              <w:pStyle w:val="Contenidodelatabla"/>
+              <w:pStyle w:val="Contenidodelatablauser"/>
               <w:bidi w:val="0"/>
               <w:jc w:val="left"/>
               <w:rPr/>
@@ -1840,7 +1860,7 @@
           </w:tcPr>
           <w:p>
             <w:pPr>
-              <w:pStyle w:val="Contenidodelatabla"/>
+              <w:pStyle w:val="Contenidodelatablauser"/>
               <w:bidi w:val="0"/>
               <w:jc w:val="left"/>
               <w:rPr/>
@@ -1864,7 +1884,7 @@
           </w:tcPr>
           <w:p>
             <w:pPr>
-              <w:pStyle w:val="Contenidodelatabla"/>
+              <w:pStyle w:val="Contenidodelatablauser"/>
               <w:bidi w:val="0"/>
               <w:jc w:val="left"/>
               <w:rPr/>
@@ -1887,7 +1907,7 @@
           </w:tcPr>
           <w:p>
             <w:pPr>
-              <w:pStyle w:val="Contenidodelatabla"/>
+              <w:pStyle w:val="Contenidodelatablauser"/>
               <w:bidi w:val="0"/>
               <w:jc w:val="left"/>
               <w:rPr/>
@@ -1909,7 +1929,7 @@
           </w:tcPr>
           <w:p>
             <w:pPr>
-              <w:pStyle w:val="Contenidodelatabla"/>
+              <w:pStyle w:val="Contenidodelatablauser"/>
               <w:bidi w:val="0"/>
               <w:jc w:val="left"/>
               <w:rPr/>
@@ -1933,7 +1953,7 @@
           </w:tcPr>
           <w:p>
             <w:pPr>
-              <w:pStyle w:val="Contenidodelatabla"/>
+              <w:pStyle w:val="Contenidodelatablauser"/>
               <w:bidi w:val="0"/>
               <w:jc w:val="left"/>
               <w:rPr/>
@@ -1956,7 +1976,7 @@
           </w:tcPr>
           <w:p>
             <w:pPr>
-              <w:pStyle w:val="Contenidodelatabla"/>
+              <w:pStyle w:val="Contenidodelatablauser"/>
               <w:bidi w:val="0"/>
               <w:jc w:val="left"/>
               <w:rPr/>
@@ -1978,7 +1998,7 @@
           </w:tcPr>
           <w:p>
             <w:pPr>
-              <w:pStyle w:val="Contenidodelatabla"/>
+              <w:pStyle w:val="Contenidodelatablauser"/>
               <w:bidi w:val="0"/>
               <w:jc w:val="left"/>
               <w:rPr/>
@@ -2037,6 +2057,10 @@
     <w:p>
       <w:pPr>
         <w:pStyle w:val="Heading2"/>
+        <w:numPr>
+          <w:ilvl w:val="1"/>
+          <w:numId w:val="1"/>
+        </w:numPr>
         <w:bidi w:val="0"/>
         <w:spacing w:before="0" w:after="0"/>
         <w:ind w:hanging="0" w:left="0"/>
@@ -2149,6 +2173,7 @@
       <w:pgNumType w:fmt="decimal"/>
       <w:formProt w:val="false"/>
       <w:textDirection w:val="lrTb"/>
+      <w:docGrid w:type="default" w:linePitch="100" w:charSpace="0"/>
     </w:sectPr>
   </w:body>
 </w:document>
@@ -2169,36 +2194,9 @@
         </w:tabs>
         <w:ind w:left="0" w:hanging="0"/>
       </w:pPr>
+      <w:rPr/>
     </w:lvl>
     <w:lvl w:ilvl="1">
-      <w:start w:val="1"/>
-      <w:numFmt w:val="none"/>
-      <w:pStyle w:val="Heading2"/>
-      <w:suff w:val="nothing"/>
-      <w:lvlText w:val=""/>
-      <w:lvlJc w:val="left"/>
-      <w:pPr>
-        <w:tabs>
-          <w:tab w:val="num" w:pos="0"/>
-        </w:tabs>
-        <w:ind w:left="0" w:hanging="0"/>
-      </w:pPr>
-    </w:lvl>
-    <w:lvl w:ilvl="2">
-      <w:start w:val="1"/>
-      <w:numFmt w:val="none"/>
-      <w:pStyle w:val="Heading3"/>
-      <w:suff w:val="nothing"/>
-      <w:lvlText w:val=""/>
-      <w:lvlJc w:val="left"/>
-      <w:pPr>
-        <w:tabs>
-          <w:tab w:val="num" w:pos="0"/>
-        </w:tabs>
-        <w:ind w:left="0" w:hanging="0"/>
-      </w:pPr>
-    </w:lvl>
-    <w:lvl w:ilvl="3">
       <w:start w:val="1"/>
       <w:numFmt w:val="none"/>
       <w:suff w:val="nothing"/>
@@ -2210,8 +2208,9 @@
         </w:tabs>
         <w:ind w:left="0" w:hanging="0"/>
       </w:pPr>
-    </w:lvl>
-    <w:lvl w:ilvl="4">
+      <w:rPr/>
+    </w:lvl>
+    <w:lvl w:ilvl="2">
       <w:start w:val="1"/>
       <w:numFmt w:val="none"/>
       <w:suff w:val="nothing"/>
@@ -2223,8 +2222,9 @@
         </w:tabs>
         <w:ind w:left="0" w:hanging="0"/>
       </w:pPr>
-    </w:lvl>
-    <w:lvl w:ilvl="5">
+      <w:rPr/>
+    </w:lvl>
+    <w:lvl w:ilvl="3">
       <w:start w:val="1"/>
       <w:numFmt w:val="none"/>
       <w:suff w:val="nothing"/>
@@ -2236,8 +2236,9 @@
         </w:tabs>
         <w:ind w:left="0" w:hanging="0"/>
       </w:pPr>
-    </w:lvl>
-    <w:lvl w:ilvl="6">
+      <w:rPr/>
+    </w:lvl>
+    <w:lvl w:ilvl="4">
       <w:start w:val="1"/>
       <w:numFmt w:val="none"/>
       <w:suff w:val="nothing"/>
@@ -2249,8 +2250,9 @@
         </w:tabs>
         <w:ind w:left="0" w:hanging="0"/>
       </w:pPr>
-    </w:lvl>
-    <w:lvl w:ilvl="7">
+      <w:rPr/>
+    </w:lvl>
+    <w:lvl w:ilvl="5">
       <w:start w:val="1"/>
       <w:numFmt w:val="none"/>
       <w:suff w:val="nothing"/>
@@ -2262,8 +2264,9 @@
         </w:tabs>
         <w:ind w:left="0" w:hanging="0"/>
       </w:pPr>
-    </w:lvl>
-    <w:lvl w:ilvl="8">
+      <w:rPr/>
+    </w:lvl>
+    <w:lvl w:ilvl="6">
       <w:start w:val="1"/>
       <w:numFmt w:val="none"/>
       <w:suff w:val="nothing"/>
@@ -2275,6 +2278,35 @@
         </w:tabs>
         <w:ind w:left="0" w:hanging="0"/>
       </w:pPr>
+      <w:rPr/>
+    </w:lvl>
+    <w:lvl w:ilvl="7">
+      <w:start w:val="1"/>
+      <w:numFmt w:val="none"/>
+      <w:suff w:val="nothing"/>
+      <w:lvlText w:val=""/>
+      <w:lvlJc w:val="left"/>
+      <w:pPr>
+        <w:tabs>
+          <w:tab w:val="num" w:pos="0"/>
+        </w:tabs>
+        <w:ind w:left="0" w:hanging="0"/>
+      </w:pPr>
+      <w:rPr/>
+    </w:lvl>
+    <w:lvl w:ilvl="8">
+      <w:start w:val="1"/>
+      <w:numFmt w:val="none"/>
+      <w:suff w:val="nothing"/>
+      <w:lvlText w:val=""/>
+      <w:lvlJc w:val="left"/>
+      <w:pPr>
+        <w:tabs>
+          <w:tab w:val="num" w:pos="0"/>
+        </w:tabs>
+        <w:ind w:left="0" w:hanging="0"/>
+      </w:pPr>
+      <w:rPr/>
     </w:lvl>
   </w:abstractNum>
   <w:abstractNum w:abstractNumId="2">
@@ -3198,6 +3230,125 @@
       <w:rPr>
         <w:rFonts w:ascii="Symbol" w:hAnsi="Symbol" w:cs="Symbol" w:hint="default"/>
       </w:rPr>
+    </w:lvl>
+  </w:abstractNum>
+  <w:abstractNum w:abstractNumId="9">
+    <w:lvl w:ilvl="0">
+      <w:start w:val="1"/>
+      <w:numFmt w:val="none"/>
+      <w:suff w:val="nothing"/>
+      <w:lvlText w:val=""/>
+      <w:lvlJc w:val="left"/>
+      <w:pPr>
+        <w:tabs>
+          <w:tab w:val="num" w:pos="0"/>
+        </w:tabs>
+        <w:ind w:left="0" w:hanging="0"/>
+      </w:pPr>
+    </w:lvl>
+    <w:lvl w:ilvl="1">
+      <w:start w:val="1"/>
+      <w:numFmt w:val="none"/>
+      <w:suff w:val="nothing"/>
+      <w:lvlText w:val=""/>
+      <w:lvlJc w:val="left"/>
+      <w:pPr>
+        <w:tabs>
+          <w:tab w:val="num" w:pos="0"/>
+        </w:tabs>
+        <w:ind w:left="0" w:hanging="0"/>
+      </w:pPr>
+    </w:lvl>
+    <w:lvl w:ilvl="2">
+      <w:start w:val="1"/>
+      <w:numFmt w:val="none"/>
+      <w:suff w:val="nothing"/>
+      <w:lvlText w:val=""/>
+      <w:lvlJc w:val="left"/>
+      <w:pPr>
+        <w:tabs>
+          <w:tab w:val="num" w:pos="0"/>
+        </w:tabs>
+        <w:ind w:left="0" w:hanging="0"/>
+      </w:pPr>
+    </w:lvl>
+    <w:lvl w:ilvl="3">
+      <w:start w:val="1"/>
+      <w:numFmt w:val="none"/>
+      <w:suff w:val="nothing"/>
+      <w:lvlText w:val=""/>
+      <w:lvlJc w:val="left"/>
+      <w:pPr>
+        <w:tabs>
+          <w:tab w:val="num" w:pos="0"/>
+        </w:tabs>
+        <w:ind w:left="0" w:hanging="0"/>
+      </w:pPr>
+    </w:lvl>
+    <w:lvl w:ilvl="4">
+      <w:start w:val="1"/>
+      <w:numFmt w:val="none"/>
+      <w:suff w:val="nothing"/>
+      <w:lvlText w:val=""/>
+      <w:lvlJc w:val="left"/>
+      <w:pPr>
+        <w:tabs>
+          <w:tab w:val="num" w:pos="0"/>
+        </w:tabs>
+        <w:ind w:left="0" w:hanging="0"/>
+      </w:pPr>
+    </w:lvl>
+    <w:lvl w:ilvl="5">
+      <w:start w:val="1"/>
+      <w:numFmt w:val="none"/>
+      <w:suff w:val="nothing"/>
+      <w:lvlText w:val=""/>
+      <w:lvlJc w:val="left"/>
+      <w:pPr>
+        <w:tabs>
+          <w:tab w:val="num" w:pos="0"/>
+        </w:tabs>
+        <w:ind w:left="0" w:hanging="0"/>
+      </w:pPr>
+    </w:lvl>
+    <w:lvl w:ilvl="6">
+      <w:start w:val="1"/>
+      <w:numFmt w:val="none"/>
+      <w:suff w:val="nothing"/>
+      <w:lvlText w:val=""/>
+      <w:lvlJc w:val="left"/>
+      <w:pPr>
+        <w:tabs>
+          <w:tab w:val="num" w:pos="0"/>
+        </w:tabs>
+        <w:ind w:left="0" w:hanging="0"/>
+      </w:pPr>
+    </w:lvl>
+    <w:lvl w:ilvl="7">
+      <w:start w:val="1"/>
+      <w:numFmt w:val="none"/>
+      <w:suff w:val="nothing"/>
+      <w:lvlText w:val=""/>
+      <w:lvlJc w:val="left"/>
+      <w:pPr>
+        <w:tabs>
+          <w:tab w:val="num" w:pos="0"/>
+        </w:tabs>
+        <w:ind w:left="0" w:hanging="0"/>
+      </w:pPr>
+    </w:lvl>
+    <w:lvl w:ilvl="8">
+      <w:start w:val="1"/>
+      <w:numFmt w:val="none"/>
+      <w:suff w:val="nothing"/>
+      <w:lvlText w:val=""/>
+      <w:lvlJc w:val="left"/>
+      <w:pPr>
+        <w:tabs>
+          <w:tab w:val="num" w:pos="0"/>
+        </w:tabs>
+        <w:ind w:left="0" w:hanging="0"/>
+      </w:pPr>
     </w:lvl>
   </w:abstractNum>
   <w:num w:numId="1">
@@ -3224,6 +3375,9 @@
   <w:num w:numId="8">
     <w:abstractNumId w:val="8"/>
   </w:num>
+  <w:num w:numId="9">
+    <w:abstractNumId w:val="9"/>
+  </w:num>
 </w:numbering>
 </file>
 
@@ -3241,7 +3395,6 @@
     </w:rPrDefault>
     <w:pPrDefault>
       <w:pPr>
-        <w:widowControl/>
         <w:suppressAutoHyphens w:val="true"/>
       </w:pPr>
     </w:pPrDefault>
@@ -3251,7 +3404,10 @@
     <w:qFormat/>
     <w:pPr>
       <w:widowControl/>
+      <w:suppressAutoHyphens w:val="true"/>
       <w:bidi w:val="0"/>
+      <w:spacing w:before="0" w:after="0"/>
+      <w:jc w:val="left"/>
     </w:pPr>
     <w:rPr>
       <w:rFonts w:ascii="Arial" w:hAnsi="Arial" w:eastAsia="NSimSun" w:cs="Lucida Sans"/>
@@ -3264,7 +3420,7 @@
   </w:style>
   <w:style w:type="paragraph" w:styleId="Heading2">
     <w:name w:val="heading 2"/>
-    <w:basedOn w:val="Ttulo"/>
+    <w:basedOn w:val="Ttulouser"/>
     <w:next w:val="BodyText"/>
     <w:qFormat/>
     <w:pPr>
@@ -3284,7 +3440,7 @@
   </w:style>
   <w:style w:type="paragraph" w:styleId="Heading3">
     <w:name w:val="heading 3"/>
-    <w:basedOn w:val="Ttulo"/>
+    <w:basedOn w:val="Ttulouser"/>
     <w:next w:val="BodyText"/>
     <w:qFormat/>
     <w:pPr>
@@ -3302,13 +3458,13 @@
       <w:szCs w:val="28"/>
     </w:rPr>
   </w:style>
-  <w:style w:type="character" w:styleId="Smbolosdenumeracin">
-    <w:name w:val="Símbolos de numeración"/>
+  <w:style w:type="character" w:styleId="Smbolosdenumeracinuser">
+    <w:name w:val="Símbolos de numeración (user)"/>
     <w:qFormat/>
     <w:rPr/>
   </w:style>
-  <w:style w:type="character" w:styleId="Bolos">
-    <w:name w:val="Bolos"/>
+  <w:style w:type="character" w:styleId="Bolosuser">
+    <w:name w:val="Bolos (user)"/>
     <w:qFormat/>
     <w:rPr>
       <w:rFonts w:ascii="OpenSymbol" w:hAnsi="OpenSymbol" w:eastAsia="OpenSymbol" w:cs="OpenSymbol"/>
@@ -3374,8 +3530,35 @@
       <w:sz w:val="24"/>
     </w:rPr>
   </w:style>
-  <w:style w:type="paragraph" w:styleId="Lneahorizontal">
-    <w:name w:val="Línea horizontal"/>
+  <w:style w:type="paragraph" w:styleId="Ttulouser">
+    <w:name w:val="Título (user)"/>
+    <w:basedOn w:val="Normal"/>
+    <w:next w:val="BodyText"/>
+    <w:qFormat/>
+    <w:pPr>
+      <w:keepNext w:val="true"/>
+      <w:spacing w:before="240" w:after="120"/>
+    </w:pPr>
+    <w:rPr>
+      <w:rFonts w:ascii="Times New Roman" w:hAnsi="Times New Roman" w:eastAsia="Microsoft YaHei" w:cs="Lucida Sans"/>
+      <w:sz w:val="28"/>
+      <w:szCs w:val="28"/>
+    </w:rPr>
+  </w:style>
+  <w:style w:type="paragraph" w:styleId="ndiceuser">
+    <w:name w:val="Índice (user)"/>
+    <w:basedOn w:val="Normal"/>
+    <w:qFormat/>
+    <w:pPr>
+      <w:suppressLineNumbers/>
+    </w:pPr>
+    <w:rPr>
+      <w:rFonts w:ascii="Arial" w:hAnsi="Arial" w:cs="Lucida Sans"/>
+      <w:sz w:val="24"/>
+    </w:rPr>
+  </w:style>
+  <w:style w:type="paragraph" w:styleId="Lneahorizontaluser">
+    <w:name w:val="Línea horizontal (user)"/>
     <w:basedOn w:val="Normal"/>
     <w:next w:val="BodyText"/>
     <w:qFormat/>
@@ -3391,8 +3574,8 @@
       <w:szCs w:val="12"/>
     </w:rPr>
   </w:style>
-  <w:style w:type="paragraph" w:styleId="Textopreformateado">
-    <w:name w:val="Texto preformateado"/>
+  <w:style w:type="paragraph" w:styleId="Textopreformateadouser">
+    <w:name w:val="Texto preformateado (user)"/>
     <w:basedOn w:val="Normal"/>
     <w:qFormat/>
     <w:pPr>
@@ -3404,8 +3587,8 @@
       <w:szCs w:val="20"/>
     </w:rPr>
   </w:style>
-  <w:style w:type="paragraph" w:styleId="Citaenbloque">
-    <w:name w:val="Cita en bloque"/>
+  <w:style w:type="paragraph" w:styleId="Citaenbloqueuser">
+    <w:name w:val="Cita en bloque (user)"/>
     <w:basedOn w:val="Normal"/>
     <w:qFormat/>
     <w:pPr>
@@ -3414,8 +3597,8 @@
     </w:pPr>
     <w:rPr/>
   </w:style>
-  <w:style w:type="paragraph" w:styleId="Contenidodelatabla">
-    <w:name w:val="Contenido de la tabla"/>
+  <w:style w:type="paragraph" w:styleId="Contenidodelatablauser">
+    <w:name w:val="Contenido de la tabla (user)"/>
     <w:basedOn w:val="Normal"/>
     <w:qFormat/>
     <w:pPr>
@@ -3424,9 +3607,9 @@
     </w:pPr>
     <w:rPr/>
   </w:style>
-  <w:style w:type="paragraph" w:styleId="Ttulodelatabla">
-    <w:name w:val="Título de la tabla"/>
-    <w:basedOn w:val="Contenidodelatabla"/>
+  <w:style w:type="paragraph" w:styleId="Ttulodelatablauser">
+    <w:name w:val="Título de la tabla (user)"/>
+    <w:basedOn w:val="Contenidodelatablauser"/>
     <w:qFormat/>
     <w:pPr>
       <w:suppressLineNumbers/>

</xml_diff>